<commit_message>
Rename iOS project and target to Baseball
</commit_message>
<xml_diff>
--- a/docs/야구_못하면_또_환생함_Master_Spec_v1.0.docx
+++ b/docs/야구_못하면_또_환생함_Master_Spec_v1.0.docx
@@ -7,31 +7,31 @@
         <w:pStyle w:val="Title"/>
       </w:pPr>
       <w:r>
-        <w:t xml:space="preserve">PROJECT</w:t>
-      </w:r>
-      <w:r>
-        <w:t xml:space="preserve"> </w:t>
-      </w:r>
-      <w:r>
-        <w:t xml:space="preserve">DIAMOND</w:t>
-      </w:r>
-      <w:r>
-        <w:t xml:space="preserve"> </w:t>
-      </w:r>
-      <w:r>
-        <w:t xml:space="preserve">SOUL</w:t>
-      </w:r>
-      <w:r>
-        <w:t xml:space="preserve"> </w:t>
-      </w:r>
-      <w:r>
-        <w:t xml:space="preserve">/</w:t>
-      </w:r>
-      <w:r>
-        <w:t xml:space="preserve"> </w:t>
-      </w:r>
-      <w:r>
-        <w:t xml:space="preserve">야구혼</w:t>
+        <w:t xml:space="preserve">야구 못하면 또 환생함</w:t>
+      </w:r>
+      <w:r>
+        <w:t xml:space="preserve"/>
+      </w:r>
+      <w:r>
+        <w:t xml:space="preserve"/>
+      </w:r>
+      <w:r>
+        <w:t xml:space="preserve"/>
+      </w:r>
+      <w:r>
+        <w:t xml:space="preserve"/>
+      </w:r>
+      <w:r>
+        <w:t xml:space="preserve"/>
+      </w:r>
+      <w:r>
+        <w:t xml:space="preserve"/>
+      </w:r>
+      <w:r>
+        <w:t xml:space="preserve"/>
+      </w:r>
+      <w:r>
+        <w:t xml:space="preserve"/>
       </w:r>
     </w:p>
     <w:p>
@@ -718,7 +718,7 @@
               <w:jc w:val="left"/>
             </w:pPr>
             <w:r>
-              <w:t xml:space="preserve">프로젝트 코드명</w:t>
+              <w:t xml:space="preserve">구 코드명</w:t>
             </w:r>
           </w:p>
         </w:tc>
@@ -734,7 +734,37 @@
                 <w:b/>
                 <w:bCs/>
               </w:rPr>
-              <w:t xml:space="preserve">야구 못하면 또 환생함 (구 코드명; 내부 식별자 diamond-soul 유지)</w:t>
+              <w:t xml:space="preserve">Project Diamond Soul</w:t>
+            </w:r>
+          </w:p>
+        </w:tc>
+      </w:tr>
+      <w:tr>
+        <w:tc>
+          <w:tcPr/>
+          <w:p>
+            <w:pPr>
+              <w:pStyle w:val="Compact"/>
+              <w:jc w:val="left"/>
+            </w:pPr>
+            <w:r>
+              <w:t xml:space="preserve">내부 식별자</w:t>
+            </w:r>
+          </w:p>
+        </w:tc>
+        <w:tc>
+          <w:tcPr/>
+          <w:p>
+            <w:pPr>
+              <w:pStyle w:val="Compact"/>
+              <w:jc w:val="left"/>
+            </w:pPr>
+            <w:r>
+              <w:rPr>
+                <w:b/>
+                <w:bCs/>
+              </w:rPr>
+              <w:t xml:space="preserve">baseball</w:t>
             </w:r>
           </w:p>
         </w:tc>
@@ -3044,7 +3074,7 @@
               <w:jc w:val="left"/>
             </w:pPr>
             <w:r>
-              <w:t xml:space="preserve">야구 못하면 또 환생함 (구 코드명; 내부 식별자 diamond-soul 유지)</w:t>
+              <w:t xml:space="preserve">야구 못하면 또 환생함</w:t>
             </w:r>
           </w:p>
         </w:tc>
@@ -36348,7 +36378,7 @@
         <w:rPr>
           <w:rStyle w:val="FunctionTok"/>
         </w:rPr>
-        <w:t xml:space="preserve">{</w:t>
+        <w:t xml:space="preserve">{  "format":"BaseballSave",  "schemaVersion":4,  "engineVersion":"0.7.0",  "contentVersion":"base-0.7.0",  "worldID":"...",  "careerID":"...",  "revision":4182,  "createdAt":"2026-07-21T00:00:00Z",  "lastSavedAt":"2026-07-21T01:12:04Z",  "activeContentPacks":[{"id":"base","version":"0.7.0"}]}</w:t>
       </w:r>
       <w:r>
         <w:br/>
@@ -36357,31 +36387,31 @@
         <w:rPr>
           <w:rStyle w:val="NormalTok"/>
         </w:rPr>
-        <w:t xml:space="preserve">  </w:t>
+        <w:t xml:space="preserve"/>
       </w:r>
       <w:r>
         <w:rPr>
           <w:rStyle w:val="DataTypeTok"/>
         </w:rPr>
-        <w:t xml:space="preserve">"format"</w:t>
+        <w:t xml:space="preserve"/>
       </w:r>
       <w:r>
         <w:rPr>
           <w:rStyle w:val="FunctionTok"/>
         </w:rPr>
-        <w:t xml:space="preserve">:</w:t>
+        <w:t xml:space="preserve"/>
       </w:r>
       <w:r>
         <w:rPr>
           <w:rStyle w:val="StringTok"/>
         </w:rPr>
-        <w:t xml:space="preserve">"DiamondSoulSave"</w:t>
+        <w:t xml:space="preserve"/>
       </w:r>
       <w:r>
         <w:rPr>
           <w:rStyle w:val="FunctionTok"/>
         </w:rPr>
-        <w:t xml:space="preserve">,</w:t>
+        <w:t xml:space="preserve"/>
       </w:r>
       <w:r>
         <w:br/>
@@ -36390,31 +36420,31 @@
         <w:rPr>
           <w:rStyle w:val="NormalTok"/>
         </w:rPr>
-        <w:t xml:space="preserve">  </w:t>
+        <w:t xml:space="preserve"/>
       </w:r>
       <w:r>
         <w:rPr>
           <w:rStyle w:val="DataTypeTok"/>
         </w:rPr>
-        <w:t xml:space="preserve">"schemaVersion"</w:t>
+        <w:t xml:space="preserve"/>
       </w:r>
       <w:r>
         <w:rPr>
           <w:rStyle w:val="FunctionTok"/>
         </w:rPr>
-        <w:t xml:space="preserve">:</w:t>
+        <w:t xml:space="preserve"/>
       </w:r>
       <w:r>
         <w:rPr>
           <w:rStyle w:val="DecValTok"/>
         </w:rPr>
-        <w:t xml:space="preserve">4</w:t>
+        <w:t xml:space="preserve"/>
       </w:r>
       <w:r>
         <w:rPr>
           <w:rStyle w:val="FunctionTok"/>
         </w:rPr>
-        <w:t xml:space="preserve">,</w:t>
+        <w:t xml:space="preserve"/>
       </w:r>
       <w:r>
         <w:br/>
@@ -36423,31 +36453,31 @@
         <w:rPr>
           <w:rStyle w:val="NormalTok"/>
         </w:rPr>
-        <w:t xml:space="preserve">  </w:t>
+        <w:t xml:space="preserve"/>
       </w:r>
       <w:r>
         <w:rPr>
           <w:rStyle w:val="DataTypeTok"/>
         </w:rPr>
-        <w:t xml:space="preserve">"engineVersion"</w:t>
+        <w:t xml:space="preserve"/>
       </w:r>
       <w:r>
         <w:rPr>
           <w:rStyle w:val="FunctionTok"/>
         </w:rPr>
-        <w:t xml:space="preserve">:</w:t>
+        <w:t xml:space="preserve"/>
       </w:r>
       <w:r>
         <w:rPr>
           <w:rStyle w:val="StringTok"/>
         </w:rPr>
-        <w:t xml:space="preserve">"0.7.0"</w:t>
+        <w:t xml:space="preserve"/>
       </w:r>
       <w:r>
         <w:rPr>
           <w:rStyle w:val="FunctionTok"/>
         </w:rPr>
-        <w:t xml:space="preserve">,</w:t>
+        <w:t xml:space="preserve"/>
       </w:r>
       <w:r>
         <w:br/>
@@ -36456,31 +36486,31 @@
         <w:rPr>
           <w:rStyle w:val="NormalTok"/>
         </w:rPr>
-        <w:t xml:space="preserve">  </w:t>
+        <w:t xml:space="preserve"/>
       </w:r>
       <w:r>
         <w:rPr>
           <w:rStyle w:val="DataTypeTok"/>
         </w:rPr>
-        <w:t xml:space="preserve">"contentVersion"</w:t>
+        <w:t xml:space="preserve"/>
       </w:r>
       <w:r>
         <w:rPr>
           <w:rStyle w:val="FunctionTok"/>
         </w:rPr>
-        <w:t xml:space="preserve">:</w:t>
+        <w:t xml:space="preserve"/>
       </w:r>
       <w:r>
         <w:rPr>
           <w:rStyle w:val="StringTok"/>
         </w:rPr>
-        <w:t xml:space="preserve">"base-0.7.0"</w:t>
+        <w:t xml:space="preserve"/>
       </w:r>
       <w:r>
         <w:rPr>
           <w:rStyle w:val="FunctionTok"/>
         </w:rPr>
-        <w:t xml:space="preserve">,</w:t>
+        <w:t xml:space="preserve"/>
       </w:r>
       <w:r>
         <w:br/>
@@ -36489,31 +36519,31 @@
         <w:rPr>
           <w:rStyle w:val="NormalTok"/>
         </w:rPr>
-        <w:t xml:space="preserve">  </w:t>
+        <w:t xml:space="preserve"/>
       </w:r>
       <w:r>
         <w:rPr>
           <w:rStyle w:val="DataTypeTok"/>
         </w:rPr>
-        <w:t xml:space="preserve">"worldID"</w:t>
+        <w:t xml:space="preserve"/>
       </w:r>
       <w:r>
         <w:rPr>
           <w:rStyle w:val="FunctionTok"/>
         </w:rPr>
-        <w:t xml:space="preserve">:</w:t>
+        <w:t xml:space="preserve"/>
       </w:r>
       <w:r>
         <w:rPr>
           <w:rStyle w:val="StringTok"/>
         </w:rPr>
-        <w:t xml:space="preserve">"..."</w:t>
+        <w:t xml:space="preserve"/>
       </w:r>
       <w:r>
         <w:rPr>
           <w:rStyle w:val="FunctionTok"/>
         </w:rPr>
-        <w:t xml:space="preserve">,</w:t>
+        <w:t xml:space="preserve"/>
       </w:r>
       <w:r>
         <w:br/>
@@ -36522,31 +36552,31 @@
         <w:rPr>
           <w:rStyle w:val="NormalTok"/>
         </w:rPr>
-        <w:t xml:space="preserve">  </w:t>
+        <w:t xml:space="preserve"/>
       </w:r>
       <w:r>
         <w:rPr>
           <w:rStyle w:val="DataTypeTok"/>
         </w:rPr>
-        <w:t xml:space="preserve">"careerID"</w:t>
+        <w:t xml:space="preserve"/>
       </w:r>
       <w:r>
         <w:rPr>
           <w:rStyle w:val="FunctionTok"/>
         </w:rPr>
-        <w:t xml:space="preserve">:</w:t>
+        <w:t xml:space="preserve"/>
       </w:r>
       <w:r>
         <w:rPr>
           <w:rStyle w:val="StringTok"/>
         </w:rPr>
-        <w:t xml:space="preserve">"..."</w:t>
+        <w:t xml:space="preserve"/>
       </w:r>
       <w:r>
         <w:rPr>
           <w:rStyle w:val="FunctionTok"/>
         </w:rPr>
-        <w:t xml:space="preserve">,</w:t>
+        <w:t xml:space="preserve"/>
       </w:r>
       <w:r>
         <w:br/>
@@ -36555,31 +36585,31 @@
         <w:rPr>
           <w:rStyle w:val="NormalTok"/>
         </w:rPr>
-        <w:t xml:space="preserve">  </w:t>
+        <w:t xml:space="preserve"/>
       </w:r>
       <w:r>
         <w:rPr>
           <w:rStyle w:val="DataTypeTok"/>
         </w:rPr>
-        <w:t xml:space="preserve">"revision"</w:t>
+        <w:t xml:space="preserve"/>
       </w:r>
       <w:r>
         <w:rPr>
           <w:rStyle w:val="FunctionTok"/>
         </w:rPr>
-        <w:t xml:space="preserve">:</w:t>
+        <w:t xml:space="preserve"/>
       </w:r>
       <w:r>
         <w:rPr>
           <w:rStyle w:val="DecValTok"/>
         </w:rPr>
-        <w:t xml:space="preserve">4182</w:t>
+        <w:t xml:space="preserve"/>
       </w:r>
       <w:r>
         <w:rPr>
           <w:rStyle w:val="FunctionTok"/>
         </w:rPr>
-        <w:t xml:space="preserve">,</w:t>
+        <w:t xml:space="preserve"/>
       </w:r>
       <w:r>
         <w:br/>
@@ -36588,31 +36618,31 @@
         <w:rPr>
           <w:rStyle w:val="NormalTok"/>
         </w:rPr>
-        <w:t xml:space="preserve">  </w:t>
+        <w:t xml:space="preserve"/>
       </w:r>
       <w:r>
         <w:rPr>
           <w:rStyle w:val="DataTypeTok"/>
         </w:rPr>
-        <w:t xml:space="preserve">"createdAt"</w:t>
+        <w:t xml:space="preserve"/>
       </w:r>
       <w:r>
         <w:rPr>
           <w:rStyle w:val="FunctionTok"/>
         </w:rPr>
-        <w:t xml:space="preserve">:</w:t>
+        <w:t xml:space="preserve"/>
       </w:r>
       <w:r>
         <w:rPr>
           <w:rStyle w:val="StringTok"/>
         </w:rPr>
-        <w:t xml:space="preserve">"2026-07-21T00:00:00Z"</w:t>
+        <w:t xml:space="preserve"/>
       </w:r>
       <w:r>
         <w:rPr>
           <w:rStyle w:val="FunctionTok"/>
         </w:rPr>
-        <w:t xml:space="preserve">,</w:t>
+        <w:t xml:space="preserve"/>
       </w:r>
       <w:r>
         <w:br/>
@@ -36621,31 +36651,31 @@
         <w:rPr>
           <w:rStyle w:val="NormalTok"/>
         </w:rPr>
-        <w:t xml:space="preserve">  </w:t>
+        <w:t xml:space="preserve"/>
       </w:r>
       <w:r>
         <w:rPr>
           <w:rStyle w:val="DataTypeTok"/>
         </w:rPr>
-        <w:t xml:space="preserve">"lastSavedAt"</w:t>
+        <w:t xml:space="preserve"/>
       </w:r>
       <w:r>
         <w:rPr>
           <w:rStyle w:val="FunctionTok"/>
         </w:rPr>
-        <w:t xml:space="preserve">:</w:t>
+        <w:t xml:space="preserve"/>
       </w:r>
       <w:r>
         <w:rPr>
           <w:rStyle w:val="StringTok"/>
         </w:rPr>
-        <w:t xml:space="preserve">"2026-07-21T01:12:04Z"</w:t>
+        <w:t xml:space="preserve"/>
       </w:r>
       <w:r>
         <w:rPr>
           <w:rStyle w:val="FunctionTok"/>
         </w:rPr>
-        <w:t xml:space="preserve">,</w:t>
+        <w:t xml:space="preserve"/>
       </w:r>
       <w:r>
         <w:br/>
@@ -36654,85 +36684,85 @@
         <w:rPr>
           <w:rStyle w:val="NormalTok"/>
         </w:rPr>
-        <w:t xml:space="preserve">  </w:t>
+        <w:t xml:space="preserve"/>
       </w:r>
       <w:r>
         <w:rPr>
           <w:rStyle w:val="DataTypeTok"/>
         </w:rPr>
-        <w:t xml:space="preserve">"activeContentPacks"</w:t>
+        <w:t xml:space="preserve"/>
       </w:r>
       <w:r>
         <w:rPr>
           <w:rStyle w:val="FunctionTok"/>
         </w:rPr>
-        <w:t xml:space="preserve">:</w:t>
+        <w:t xml:space="preserve"/>
       </w:r>
       <w:r>
         <w:rPr>
           <w:rStyle w:val="OtherTok"/>
         </w:rPr>
-        <w:t xml:space="preserve">[</w:t>
+        <w:t xml:space="preserve"/>
       </w:r>
       <w:r>
         <w:rPr>
           <w:rStyle w:val="FunctionTok"/>
         </w:rPr>
-        <w:t xml:space="preserve">{</w:t>
+        <w:t xml:space="preserve"/>
       </w:r>
       <w:r>
         <w:rPr>
           <w:rStyle w:val="DataTypeTok"/>
         </w:rPr>
-        <w:t xml:space="preserve">"id"</w:t>
+        <w:t xml:space="preserve"/>
       </w:r>
       <w:r>
         <w:rPr>
           <w:rStyle w:val="FunctionTok"/>
         </w:rPr>
-        <w:t xml:space="preserve">:</w:t>
+        <w:t xml:space="preserve"/>
       </w:r>
       <w:r>
         <w:rPr>
           <w:rStyle w:val="StringTok"/>
         </w:rPr>
-        <w:t xml:space="preserve">"base"</w:t>
+        <w:t xml:space="preserve"/>
       </w:r>
       <w:r>
         <w:rPr>
           <w:rStyle w:val="FunctionTok"/>
         </w:rPr>
-        <w:t xml:space="preserve">,</w:t>
+        <w:t xml:space="preserve"/>
       </w:r>
       <w:r>
         <w:rPr>
           <w:rStyle w:val="DataTypeTok"/>
         </w:rPr>
-        <w:t xml:space="preserve">"version"</w:t>
+        <w:t xml:space="preserve"/>
       </w:r>
       <w:r>
         <w:rPr>
           <w:rStyle w:val="FunctionTok"/>
         </w:rPr>
-        <w:t xml:space="preserve">:</w:t>
+        <w:t xml:space="preserve"/>
       </w:r>
       <w:r>
         <w:rPr>
           <w:rStyle w:val="StringTok"/>
         </w:rPr>
-        <w:t xml:space="preserve">"0.7.0"</w:t>
+        <w:t xml:space="preserve"/>
       </w:r>
       <w:r>
         <w:rPr>
           <w:rStyle w:val="FunctionTok"/>
         </w:rPr>
-        <w:t xml:space="preserve">}</w:t>
+        <w:t xml:space="preserve"/>
       </w:r>
       <w:r>
         <w:rPr>
           <w:rStyle w:val="OtherTok"/>
         </w:rPr>
-        <w:t xml:space="preserve">]</w:t>
+        <w:t xml:space="preserve"/>
       </w:r>
       <w:r>
         <w:br/>
@@ -36741,7 +36771,7 @@
         <w:rPr>
           <w:rStyle w:val="FunctionTok"/>
         </w:rPr>
-        <w:t xml:space="preserve">}</w:t>
+        <w:t xml:space="preserve"/>
       </w:r>
     </w:p>
     <w:bookmarkEnd w:id="359"/>
@@ -46514,19 +46544,19 @@
         </w:numPr>
       </w:pPr>
       <w:r>
-        <w:t xml:space="preserve">예시 Product ID:</w:t>
-      </w:r>
-      <w:r>
-        <w:t xml:space="preserve"> </w:t>
+        <w:t xml:space="preserve">예시 Product ID: com.solkim.baseball.procareer.</w:t>
+      </w:r>
+      <w:r>
+        <w:t xml:space="preserve"/>
       </w:r>
       <w:r>
         <w:rPr>
           <w:rStyle w:val="VerbatimChar"/>
         </w:rPr>
-        <w:t xml:space="preserve">com.studio.diamondsoul.procareer</w:t>
-      </w:r>
-      <w:r>
-        <w:t xml:space="preserve">.</w:t>
+        <w:t xml:space="preserve"/>
+      </w:r>
+      <w:r>
+        <w:t xml:space="preserve"/>
       </w:r>
     </w:p>
     <w:p>

</xml_diff>